<commit_message>
Add lesson 1 introduction script
</commit_message>
<xml_diff>
--- a/lesson1/Урок 1.docx
+++ b/lesson1/Урок 1.docx
@@ -21,6 +21,214 @@
       </w:r>
       <w:r>
         <w:t>Ознакомиться с интерфейсом программы, создать свои первые блоки. Создать блоки для портала</w:t>
+      </w:r>
+    </w:p>
+    <w:p>
+      <w:pPr>
+        <w:pStyle w:val="1"/>
+      </w:pPr>
+      <w:r>
+        <w:rPr>
+          <w:b w:val="0"/>
+        </w:rPr>
+        <w:t>Вступление к уроку</w:t>
+      </w:r>
+    </w:p>
+    <w:p>
+      <w:r>
+        <w:rPr>
+          <w:b w:val="0"/>
+        </w:rPr>
+        <w:t>Добрый день, ребята!</w:t>
+      </w:r>
+    </w:p>
+    <w:p>
+      <w:r>
+        <w:rPr>
+          <w:b w:val="0"/>
+        </w:rPr>
+        <w:t>Прежде чем мы начнём работу, хочу напомнить, что с программой MCreator вы уже знакомы. В прошлом модуле вы создавали свои первые элементы для модификаций: блоки, предметы, текстуры, рецепты, а также запускали и тестировали свои проекты в игре.</w:t>
+      </w:r>
+    </w:p>
+    <w:p>
+      <w:r>
+        <w:rPr>
+          <w:b w:val="0"/>
+        </w:rPr>
+        <w:t>Поэтому сегодня наша цель не просто повторить уже изученные действия. Мы начинаем новый модуль, в котором будем знакомиться с новыми инструментами, новыми возможностями программы и создавать более сложные игровые механики.</w:t>
+      </w:r>
+    </w:p>
+    <w:p>
+      <w:r>
+        <w:rPr>
+          <w:b w:val="0"/>
+        </w:rPr>
+        <w:t>Чтобы двигаться дальше, нам понадобится подготовить основу для нашего будущего проекта. На протяжении нескольких занятий мы будем создавать собственный портал с уникальным дизайном и функционалом. И сегодняшний урок посвящён созданию всех необходимых элементов, без которых портал не сможет существовать.</w:t>
+      </w:r>
+    </w:p>
+    <w:p>
+      <w:r>
+        <w:rPr>
+          <w:b w:val="0"/>
+        </w:rPr>
+        <w:t>Да, сегодня вам снова предстоит создавать блоки, предметы и текстуры. Однако теперь это не отдельные тренировочные задания, а части одного большого проекта. Всё, что вы создадите сегодня, будет использоваться на следующих уроках.</w:t>
+      </w:r>
+    </w:p>
+    <w:p>
+      <w:r>
+        <w:rPr>
+          <w:b w:val="0"/>
+        </w:rPr>
+        <w:t>Поэтому к сегодняшней работе нужно подойти особенно творчески. Представьте, что ваш портал ведёт в совершенно новый мир. Подумайте:</w:t>
+      </w:r>
+    </w:p>
+    <w:p>
+      <w:pPr>
+        <w:pStyle w:val="a7"/>
+      </w:pPr>
+      <w:r>
+        <w:rPr>
+          <w:b w:val="0"/>
+        </w:rPr>
+        <w:t>• Из какого материала сделана рамка портала?</w:t>
+      </w:r>
+    </w:p>
+    <w:p>
+      <w:pPr>
+        <w:pStyle w:val="a7"/>
+      </w:pPr>
+      <w:r>
+        <w:rPr>
+          <w:b w:val="0"/>
+        </w:rPr>
+        <w:t>• Как выглядит предмет, который способен его активировать?</w:t>
+      </w:r>
+    </w:p>
+    <w:p>
+      <w:pPr>
+        <w:pStyle w:val="a7"/>
+      </w:pPr>
+      <w:r>
+        <w:rPr>
+          <w:b w:val="0"/>
+        </w:rPr>
+        <w:t>• Какая энергия или магия заполняет портал после активации?</w:t>
+      </w:r>
+    </w:p>
+    <w:p>
+      <w:pPr>
+        <w:pStyle w:val="a7"/>
+      </w:pPr>
+      <w:r>
+        <w:rPr>
+          <w:b w:val="0"/>
+        </w:rPr>
+        <w:t>• Какие цвета, эффекты и детали помогут сделать его уникальным?</w:t>
+      </w:r>
+    </w:p>
+    <w:p>
+      <w:r>
+        <w:rPr>
+          <w:b w:val="0"/>
+        </w:rPr>
+        <w:t>Не бойтесь экспериментировать и придумывать необычные идеи. Чем интереснее будут ваши заготовки сегодня, тем более впечатляющим получится итоговый результат в конце модуля.</w:t>
+      </w:r>
+    </w:p>
+    <w:p>
+      <w:pPr>
+        <w:pStyle w:val="1"/>
+      </w:pPr>
+      <w:r>
+        <w:rPr>
+          <w:b w:val="0"/>
+        </w:rPr>
+        <w:t>План работы на уроке</w:t>
+      </w:r>
+    </w:p>
+    <w:p>
+      <w:r>
+        <w:rPr>
+          <w:b w:val="0"/>
+        </w:rPr>
+        <w:t>Сегодня мы:</w:t>
+      </w:r>
+    </w:p>
+    <w:p>
+      <w:pPr>
+        <w:pStyle w:val="a7"/>
+      </w:pPr>
+      <w:r>
+        <w:rPr>
+          <w:b w:val="0"/>
+        </w:rPr>
+        <w:t>1. Создадим блок, который станет основой рамки портала.</w:t>
+      </w:r>
+    </w:p>
+    <w:p>
+      <w:pPr>
+        <w:pStyle w:val="a7"/>
+      </w:pPr>
+      <w:r>
+        <w:rPr>
+          <w:b w:val="0"/>
+        </w:rPr>
+        <w:t>2. Разработаем и нарисуем текстуру для этого блока.</w:t>
+      </w:r>
+    </w:p>
+    <w:p>
+      <w:pPr>
+        <w:pStyle w:val="a7"/>
+      </w:pPr>
+      <w:r>
+        <w:rPr>
+          <w:b w:val="0"/>
+        </w:rPr>
+        <w:t>3. Создадим специальный предмет, который будет использоваться для активации портала.</w:t>
+      </w:r>
+    </w:p>
+    <w:p>
+      <w:pPr>
+        <w:pStyle w:val="a7"/>
+      </w:pPr>
+      <w:r>
+        <w:rPr>
+          <w:b w:val="0"/>
+        </w:rPr>
+        <w:t>4. Разработаем текстуру активного портала — того самого эффекта, который появится после его запуска.</w:t>
+      </w:r>
+    </w:p>
+    <w:p>
+      <w:pPr>
+        <w:pStyle w:val="a7"/>
+      </w:pPr>
+      <w:r>
+        <w:rPr>
+          <w:b w:val="0"/>
+        </w:rPr>
+        <w:t>5. Подготовим все необходимые ресурсы для дальнейшей работы в следующих уроках.</w:t>
+      </w:r>
+    </w:p>
+    <w:p>
+      <w:r>
+        <w:rPr>
+          <w:b w:val="0"/>
+        </w:rPr>
+        <w:t>К концу занятия у каждого из вас будет собственный набор элементов для будущего портала. На следующих уроках мы начнём объединять их в единую игровую механику и постепенно превратим набор отдельных объектов в полноценственный работающий портал.</w:t>
+      </w:r>
+    </w:p>
+    <w:p>
+      <w:r>
+        <w:rPr>
+          <w:b w:val="0"/>
+        </w:rPr>
+        <w:t>Поэтому сегодня включаем фантазию на максимум, стараемся делать уникальные дизайны и не боимся проявлять свою креативность. Начинаем работу!</w:t>
+      </w:r>
+    </w:p>
+    <w:p>
+      <w:r>
+        <w:rPr>
+          <w:b w:val="0"/>
+        </w:rPr>
       </w:r>
     </w:p>
     <w:p>

</xml_diff>